<commit_message>
Nya nya nya nya nya nya
</commit_message>
<xml_diff>
--- a/Jurnal/PENGEMBANGAN PROTOTIPE SISTEM DETEKSI KORBAN BENCANA AIR BERBASIS PENGOLAHAN CITRA DIGITAL.docx
+++ b/Jurnal/PENGEMBANGAN PROTOTIPE SISTEM DETEKSI KORBAN BENCANA AIR BERBASIS PENGOLAHAN CITRA DIGITAL.docx
@@ -37754,17 +37754,8 @@
         <w:i/>
         <w:sz w:val="20"/>
       </w:rPr>
-      <w:t xml:space="preserve"> </w:t>
+      <w:t xml:space="preserve"> Informasi</w:t>
     </w:r>
-    <w:proofErr w:type="spellStart"/>
-    <w:r>
-      <w:rPr>
-        <w:i/>
-        <w:sz w:val="20"/>
-      </w:rPr>
-      <w:t>Informasi</w:t>
-    </w:r>
-    <w:proofErr w:type="spellEnd"/>
     <w:r>
       <w:rPr>
         <w:i/>

</xml_diff>